<commit_message>
Synchronise la grille de prix/lots et met a jour les documents (notice descriptive, catalogue TMA, plaquette commerciale)
Co-Authored-By: Claude Sonnet 4.6 <noreply@anthropic.com>
</commit_message>
<xml_diff>
--- a/files/pro/notice/notice-descriptive.docx
+++ b/files/pro/notice/notice-descriptive.docx
@@ -4,16 +4,18 @@
   <w:body>
     <w:p>
       <w:pPr>
-        <w:rPr/>
-      </w:pPr>
-      <w:r>
-        <w:rPr>
-          <w:rtl w:val="0"/>
-        </w:rPr>
-      </w:r>
-    </w:p>
-    <w:p>
-      <w:pPr>
+        <w:jc w:val="both"/>
+        <w:rPr/>
+      </w:pPr>
+      <w:r>
+        <w:rPr>
+          <w:rtl w:val="0"/>
+        </w:rPr>
+      </w:r>
+    </w:p>
+    <w:p>
+      <w:pPr>
+        <w:jc w:val="both"/>
         <w:rPr/>
       </w:pPr>
       <w:r>
@@ -25,7 +27,7 @@
     <w:p>
       <w:pPr>
         <w:spacing w:after="80" w:lineRule="auto"/>
-        <w:jc w:val="center"/>
+        <w:jc w:val="both"/>
         <w:rPr/>
       </w:pPr>
       <w:r>
@@ -48,7 +50,7 @@
     <w:p>
       <w:pPr>
         <w:spacing w:after="400" w:lineRule="auto"/>
-        <w:jc w:val="center"/>
+        <w:jc w:val="both"/>
         <w:rPr/>
       </w:pPr>
       <w:r>
@@ -74,6 +76,7 @@
           <w:bottom w:color="b89650" w:space="1" w:sz="16" w:val="single"/>
         </w:pBdr>
         <w:spacing w:after="400" w:lineRule="auto"/>
+        <w:jc w:val="both"/>
         <w:rPr/>
       </w:pPr>
       <w:r>
@@ -85,7 +88,7 @@
     <w:p>
       <w:pPr>
         <w:spacing w:after="120" w:lineRule="auto"/>
-        <w:jc w:val="center"/>
+        <w:jc w:val="both"/>
         <w:rPr>
           <w:sz w:val="30"/>
           <w:szCs w:val="30"/>
@@ -110,7 +113,7 @@
     <w:p>
       <w:pPr>
         <w:spacing w:after="120" w:lineRule="auto"/>
-        <w:jc w:val="center"/>
+        <w:jc w:val="both"/>
         <w:rPr>
           <w:sz w:val="30"/>
           <w:szCs w:val="30"/>
@@ -136,7 +139,7 @@
     <w:p>
       <w:pPr>
         <w:spacing w:after="600" w:lineRule="auto"/>
-        <w:jc w:val="center"/>
+        <w:jc w:val="both"/>
         <w:rPr>
           <w:sz w:val="30"/>
           <w:szCs w:val="30"/>
@@ -193,6 +196,7 @@
           <w:p>
             <w:pPr>
               <w:shd w:fill="f5f0e8" w:val="clear"/>
+              <w:jc w:val="both"/>
               <w:rPr>
                 <w:sz w:val="30"/>
                 <w:szCs w:val="30"/>
@@ -219,6 +223,7 @@
           <w:tcPr/>
           <w:p>
             <w:pPr>
+              <w:jc w:val="both"/>
               <w:rPr>
                 <w:sz w:val="30"/>
                 <w:szCs w:val="30"/>
@@ -245,6 +250,7 @@
           <w:p>
             <w:pPr>
               <w:shd w:fill="f5f0e8" w:val="clear"/>
+              <w:jc w:val="both"/>
               <w:rPr>
                 <w:sz w:val="30"/>
                 <w:szCs w:val="30"/>
@@ -271,6 +277,7 @@
           <w:tcPr/>
           <w:p>
             <w:pPr>
+              <w:jc w:val="both"/>
               <w:rPr>
                 <w:sz w:val="30"/>
                 <w:szCs w:val="30"/>
@@ -297,6 +304,7 @@
           <w:p>
             <w:pPr>
               <w:shd w:fill="f5f0e8" w:val="clear"/>
+              <w:jc w:val="both"/>
               <w:rPr>
                 <w:sz w:val="30"/>
                 <w:szCs w:val="30"/>
@@ -323,6 +331,7 @@
           <w:tcPr/>
           <w:p>
             <w:pPr>
+              <w:jc w:val="both"/>
               <w:rPr>
                 <w:sz w:val="30"/>
                 <w:szCs w:val="30"/>
@@ -349,6 +358,7 @@
           <w:p>
             <w:pPr>
               <w:shd w:fill="f5f0e8" w:val="clear"/>
+              <w:jc w:val="both"/>
               <w:rPr>
                 <w:sz w:val="30"/>
                 <w:szCs w:val="30"/>
@@ -375,6 +385,7 @@
           <w:tcPr/>
           <w:p>
             <w:pPr>
+              <w:jc w:val="both"/>
               <w:rPr>
                 <w:sz w:val="30"/>
                 <w:szCs w:val="30"/>
@@ -386,7 +397,7 @@
                 <w:szCs w:val="30"/>
                 <w:rtl w:val="0"/>
               </w:rPr>
-              <w:t xml:space="preserve">4e trimestre 2027</w:t>
+              <w:t xml:space="preserve">3e trimestre 2028</w:t>
             </w:r>
           </w:p>
         </w:tc>
@@ -394,6 +405,7 @@
     </w:tbl>
     <w:p>
       <w:pPr>
+        <w:jc w:val="both"/>
         <w:rPr>
           <w:sz w:val="30"/>
           <w:szCs w:val="30"/>
@@ -407,6 +419,7 @@
     </w:p>
     <w:p>
       <w:pPr>
+        <w:jc w:val="both"/>
         <w:rPr>
           <w:sz w:val="30"/>
           <w:szCs w:val="30"/>
@@ -420,7 +433,7 @@
     </w:p>
     <w:p>
       <w:pPr>
-        <w:jc w:val="center"/>
+        <w:jc w:val="both"/>
         <w:rPr>
           <w:sz w:val="30"/>
           <w:szCs w:val="30"/>
@@ -434,6 +447,7 @@
     </w:p>
     <w:p>
       <w:pPr>
+        <w:jc w:val="both"/>
         <w:rPr>
           <w:sz w:val="30"/>
           <w:szCs w:val="30"/>
@@ -454,6 +468,7 @@
           <w:bottom w:color="b89650" w:space="1" w:sz="12" w:val="single"/>
         </w:pBdr>
         <w:spacing w:after="120" w:lineRule="auto"/>
+        <w:jc w:val="both"/>
         <w:rPr/>
       </w:pPr>
       <w:r>
@@ -475,6 +490,7 @@
     </w:p>
     <w:p>
       <w:pPr>
+        <w:jc w:val="both"/>
         <w:rPr/>
       </w:pPr>
       <w:r>
@@ -486,6 +502,7 @@
     <w:p>
       <w:pPr>
         <w:spacing w:after="60" w:lineRule="auto"/>
+        <w:jc w:val="both"/>
         <w:rPr/>
       </w:pPr>
       <w:r>
@@ -507,6 +524,7 @@
     <w:p>
       <w:pPr>
         <w:spacing w:after="60" w:lineRule="auto"/>
+        <w:jc w:val="both"/>
         <w:rPr/>
       </w:pPr>
       <w:r>
@@ -528,6 +546,7 @@
     <w:p>
       <w:pPr>
         <w:spacing w:after="60" w:lineRule="auto"/>
+        <w:jc w:val="both"/>
         <w:rPr/>
       </w:pPr>
       <w:r>
@@ -549,6 +568,7 @@
     <w:p>
       <w:pPr>
         <w:spacing w:after="60" w:lineRule="auto"/>
+        <w:jc w:val="both"/>
         <w:rPr/>
       </w:pPr>
       <w:r>
@@ -570,6 +590,7 @@
     <w:p>
       <w:pPr>
         <w:spacing w:after="60" w:lineRule="auto"/>
+        <w:jc w:val="both"/>
         <w:rPr/>
       </w:pPr>
       <w:r>
@@ -591,6 +612,7 @@
     <w:p>
       <w:pPr>
         <w:spacing w:after="60" w:lineRule="auto"/>
+        <w:jc w:val="both"/>
         <w:rPr/>
       </w:pPr>
       <w:r>
@@ -612,6 +634,7 @@
     <w:p>
       <w:pPr>
         <w:spacing w:after="60" w:lineRule="auto"/>
+        <w:jc w:val="both"/>
         <w:rPr/>
       </w:pPr>
       <w:r>
@@ -633,6 +656,7 @@
     <w:p>
       <w:pPr>
         <w:spacing w:after="60" w:lineRule="auto"/>
+        <w:jc w:val="both"/>
         <w:rPr/>
       </w:pPr>
       <w:r>
@@ -654,6 +678,7 @@
     <w:p>
       <w:pPr>
         <w:spacing w:after="60" w:lineRule="auto"/>
+        <w:jc w:val="both"/>
         <w:rPr/>
       </w:pPr>
       <w:r>
@@ -675,6 +700,7 @@
     <w:p>
       <w:pPr>
         <w:spacing w:after="60" w:lineRule="auto"/>
+        <w:jc w:val="both"/>
         <w:rPr/>
       </w:pPr>
       <w:r>
@@ -695,6 +721,7 @@
     </w:p>
     <w:p>
       <w:pPr>
+        <w:jc w:val="both"/>
         <w:rPr/>
       </w:pPr>
       <w:r>
@@ -712,6 +739,7 @@
         <w:pBdr>
           <w:bottom w:color="b89650" w:space="1" w:sz="8" w:val="single"/>
         </w:pBdr>
+        <w:jc w:val="both"/>
         <w:rPr/>
       </w:pPr>
       <w:r>
@@ -724,6 +752,7 @@
     <w:p>
       <w:pPr>
         <w:pStyle w:val="Heading2"/>
+        <w:jc w:val="both"/>
         <w:rPr/>
       </w:pPr>
       <w:r>
@@ -735,6 +764,7 @@
     </w:p>
     <w:p>
       <w:pPr>
+        <w:jc w:val="both"/>
         <w:rPr/>
       </w:pPr>
       <w:r>
@@ -746,6 +776,7 @@
     </w:p>
     <w:p>
       <w:pPr>
+        <w:jc w:val="both"/>
         <w:rPr/>
       </w:pPr>
       <w:r>
@@ -758,6 +789,7 @@
       <w:pPr>
         <w:spacing w:after="20" w:lineRule="auto"/>
         <w:ind w:left="397" w:hanging="227"/>
+        <w:jc w:val="both"/>
         <w:rPr/>
       </w:pPr>
       <w:r>
@@ -778,6 +810,7 @@
       <w:pPr>
         <w:spacing w:after="20" w:lineRule="auto"/>
         <w:ind w:left="397" w:hanging="227"/>
+        <w:jc w:val="both"/>
         <w:rPr/>
       </w:pPr>
       <w:r>
@@ -798,6 +831,7 @@
       <w:pPr>
         <w:spacing w:after="20" w:lineRule="auto"/>
         <w:ind w:left="397" w:hanging="227"/>
+        <w:jc w:val="both"/>
         <w:rPr/>
       </w:pPr>
       <w:r>
@@ -818,6 +852,7 @@
       <w:pPr>
         <w:spacing w:after="20" w:lineRule="auto"/>
         <w:ind w:left="397" w:hanging="227"/>
+        <w:jc w:val="both"/>
         <w:rPr/>
       </w:pPr>
       <w:r>
@@ -836,16 +871,18 @@
     </w:p>
     <w:p>
       <w:pPr>
-        <w:rPr/>
-      </w:pPr>
-      <w:r>
-        <w:rPr>
-          <w:rtl w:val="0"/>
-        </w:rPr>
-      </w:r>
-    </w:p>
-    <w:p>
-      <w:pPr>
+        <w:jc w:val="both"/>
+        <w:rPr/>
+      </w:pPr>
+      <w:r>
+        <w:rPr>
+          <w:rtl w:val="0"/>
+        </w:rPr>
+      </w:r>
+    </w:p>
+    <w:p>
+      <w:pPr>
+        <w:jc w:val="both"/>
         <w:rPr/>
       </w:pPr>
       <w:r>
@@ -857,28 +894,31 @@
     </w:p>
     <w:p>
       <w:pPr>
-        <w:rPr/>
-      </w:pPr>
-      <w:r>
-        <w:rPr>
-          <w:rtl w:val="0"/>
-        </w:rPr>
-      </w:r>
-    </w:p>
-    <w:p>
-      <w:pPr>
-        <w:rPr/>
-      </w:pPr>
-      <w:r>
-        <w:rPr>
-          <w:rtl w:val="0"/>
-        </w:rPr>
-        <w:t xml:space="preserve">La livraison est prévue au 4e trimestre 2027.</w:t>
+        <w:jc w:val="both"/>
+        <w:rPr/>
+      </w:pPr>
+      <w:r>
+        <w:rPr>
+          <w:rtl w:val="0"/>
+        </w:rPr>
+      </w:r>
+    </w:p>
+    <w:p>
+      <w:pPr>
+        <w:jc w:val="both"/>
+        <w:rPr/>
+      </w:pPr>
+      <w:r>
+        <w:rPr>
+          <w:rtl w:val="0"/>
+        </w:rPr>
+        <w:t xml:space="preserve">La livraison est prévue au 3e trimestre 2028.</w:t>
       </w:r>
     </w:p>
     <w:p>
       <w:pPr>
         <w:pStyle w:val="Heading2"/>
+        <w:jc w:val="both"/>
         <w:rPr/>
       </w:pPr>
       <w:r>
@@ -921,13 +961,14 @@
       <w:tr>
         <w:trPr>
           <w:cantSplit w:val="0"/>
-          <w:tblHeader w:val="0"/>
+          <w:tblHeader w:val="1"/>
         </w:trPr>
         <w:tc>
           <w:tcPr/>
           <w:p>
             <w:pPr>
               <w:shd w:fill="1c2b3a" w:val="clear"/>
+              <w:jc w:val="both"/>
               <w:rPr/>
             </w:pPr>
             <w:r>
@@ -953,6 +994,7 @@
           <w:p>
             <w:pPr>
               <w:shd w:fill="1c2b3a" w:val="clear"/>
+              <w:jc w:val="both"/>
               <w:rPr/>
             </w:pPr>
             <w:r>
@@ -978,6 +1020,7 @@
           <w:p>
             <w:pPr>
               <w:shd w:fill="1c2b3a" w:val="clear"/>
+              <w:jc w:val="both"/>
               <w:rPr/>
             </w:pPr>
             <w:r>
@@ -1003,6 +1046,7 @@
           <w:p>
             <w:pPr>
               <w:shd w:fill="1c2b3a" w:val="clear"/>
+              <w:jc w:val="both"/>
               <w:rPr/>
             </w:pPr>
             <w:r>
@@ -1027,13 +1071,14 @@
       <w:tr>
         <w:trPr>
           <w:cantSplit w:val="0"/>
-          <w:tblHeader w:val="0"/>
+          <w:tblHeader w:val="1"/>
         </w:trPr>
         <w:tc>
           <w:tcPr/>
           <w:p>
             <w:pPr>
               <w:shd w:fill="faf7f2" w:val="clear"/>
+              <w:jc w:val="both"/>
               <w:rPr/>
             </w:pPr>
             <w:r>
@@ -1056,6 +1101,7 @@
           <w:p>
             <w:pPr>
               <w:shd w:fill="faf7f2" w:val="clear"/>
+              <w:jc w:val="both"/>
               <w:rPr/>
             </w:pPr>
             <w:r>
@@ -1064,7 +1110,7 @@
                 <w:szCs w:val="18"/>
                 <w:rtl w:val="0"/>
               </w:rPr>
-              <w:t xml:space="preserve">30</w:t>
+              <w:t xml:space="preserve">32</w:t>
             </w:r>
             <w:r>
               <w:rPr>
@@ -1078,6 +1124,7 @@
           <w:p>
             <w:pPr>
               <w:shd w:fill="faf7f2" w:val="clear"/>
+              <w:jc w:val="both"/>
               <w:rPr/>
             </w:pPr>
             <w:r>
@@ -1100,6 +1147,7 @@
           <w:p>
             <w:pPr>
               <w:shd w:fill="faf7f2" w:val="clear"/>
+              <w:jc w:val="both"/>
               <w:rPr/>
             </w:pPr>
             <w:r>
@@ -1121,12 +1169,13 @@
       <w:tr>
         <w:trPr>
           <w:cantSplit w:val="0"/>
-          <w:tblHeader w:val="0"/>
+          <w:tblHeader w:val="1"/>
         </w:trPr>
         <w:tc>
           <w:tcPr/>
           <w:p>
             <w:pPr>
+              <w:jc w:val="both"/>
               <w:rPr/>
             </w:pPr>
             <w:r>
@@ -1148,6 +1197,7 @@
           <w:tcPr/>
           <w:p>
             <w:pPr>
+              <w:jc w:val="both"/>
               <w:rPr/>
             </w:pPr>
             <w:r>
@@ -1156,7 +1206,7 @@
                 <w:szCs w:val="18"/>
                 <w:rtl w:val="0"/>
               </w:rPr>
-              <w:t xml:space="preserve">26</w:t>
+              <w:t xml:space="preserve">24</w:t>
             </w:r>
             <w:r>
               <w:rPr>
@@ -1169,6 +1219,7 @@
           <w:tcPr/>
           <w:p>
             <w:pPr>
+              <w:jc w:val="both"/>
               <w:rPr/>
             </w:pPr>
             <w:r>
@@ -1177,7 +1228,7 @@
                 <w:szCs w:val="18"/>
                 <w:rtl w:val="0"/>
               </w:rPr>
-              <w:t xml:space="preserve">PLAI / PLUS — Hérault Logement</w:t>
+              <w:t xml:space="preserve">PLAI /PLUS/ PLS — Hérault Logement</w:t>
             </w:r>
             <w:r>
               <w:rPr>
@@ -1190,6 +1241,7 @@
           <w:tcPr/>
           <w:p>
             <w:pPr>
+              <w:jc w:val="both"/>
               <w:rPr/>
             </w:pPr>
             <w:r>
@@ -1218,6 +1270,7 @@
           <w:p>
             <w:pPr>
               <w:shd w:fill="faf7f2" w:val="clear"/>
+              <w:jc w:val="both"/>
               <w:rPr/>
             </w:pPr>
             <w:r>
@@ -1240,6 +1293,7 @@
           <w:p>
             <w:pPr>
               <w:shd w:fill="faf7f2" w:val="clear"/>
+              <w:jc w:val="both"/>
               <w:rPr/>
             </w:pPr>
             <w:r>
@@ -1262,6 +1316,7 @@
           <w:p>
             <w:pPr>
               <w:shd w:fill="faf7f2" w:val="clear"/>
+              <w:jc w:val="both"/>
               <w:rPr/>
             </w:pPr>
             <w:r>
@@ -1284,6 +1339,7 @@
           <w:p>
             <w:pPr>
               <w:shd w:fill="faf7f2" w:val="clear"/>
+              <w:jc w:val="both"/>
               <w:rPr/>
             </w:pPr>
             <w:r>
@@ -1311,6 +1367,7 @@
           <w:tcPr/>
           <w:p>
             <w:pPr>
+              <w:jc w:val="both"/>
               <w:rPr/>
             </w:pPr>
             <w:r>
@@ -1335,6 +1392,7 @@
           <w:tcPr/>
           <w:p>
             <w:pPr>
+              <w:jc w:val="both"/>
               <w:rPr/>
             </w:pPr>
             <w:r>
@@ -1359,6 +1417,7 @@
           <w:tcPr/>
           <w:p>
             <w:pPr>
+              <w:jc w:val="both"/>
               <w:rPr/>
             </w:pPr>
             <w:r>
@@ -1383,6 +1442,7 @@
           <w:tcPr/>
           <w:p>
             <w:pPr>
+              <w:jc w:val="both"/>
               <w:rPr/>
             </w:pPr>
             <w:r>
@@ -1394,7 +1454,7 @@
                 <w:szCs w:val="18"/>
                 <w:rtl w:val="0"/>
               </w:rPr>
-              <w:t xml:space="preserve">38% sociaux + 19% abordable</w:t>
+              <w:t xml:space="preserve">34% sociaux + 19% abordable</w:t>
             </w:r>
             <w:r>
               <w:rPr>
@@ -1407,6 +1467,7 @@
     </w:tbl>
     <w:p>
       <w:pPr>
+        <w:jc w:val="both"/>
         <w:rPr/>
       </w:pPr>
       <w:r>
@@ -1418,6 +1479,7 @@
     <w:p>
       <w:pPr>
         <w:pStyle w:val="Heading2"/>
+        <w:jc w:val="both"/>
         <w:rPr/>
       </w:pPr>
       <w:r>
@@ -1429,6 +1491,7 @@
     </w:p>
     <w:p>
       <w:pPr>
+        <w:jc w:val="both"/>
         <w:rPr/>
       </w:pPr>
       <w:r>
@@ -1442,6 +1505,7 @@
       <w:pPr>
         <w:spacing w:after="20" w:lineRule="auto"/>
         <w:ind w:left="397" w:hanging="227"/>
+        <w:jc w:val="both"/>
         <w:rPr/>
       </w:pPr>
       <w:r>
@@ -1462,6 +1526,7 @@
       <w:pPr>
         <w:spacing w:after="20" w:lineRule="auto"/>
         <w:ind w:left="397" w:hanging="227"/>
+        <w:jc w:val="both"/>
         <w:rPr/>
       </w:pPr>
       <w:r>
@@ -1482,6 +1547,7 @@
       <w:pPr>
         <w:spacing w:after="20" w:lineRule="auto"/>
         <w:ind w:left="397" w:hanging="227"/>
+        <w:jc w:val="both"/>
         <w:rPr/>
       </w:pPr>
       <w:r>
@@ -1502,6 +1568,7 @@
       <w:pPr>
         <w:spacing w:after="20" w:lineRule="auto"/>
         <w:ind w:left="397" w:hanging="227"/>
+        <w:jc w:val="both"/>
         <w:rPr/>
       </w:pPr>
       <w:r>
@@ -1522,6 +1589,7 @@
       <w:pPr>
         <w:spacing w:after="20" w:lineRule="auto"/>
         <w:ind w:left="397" w:hanging="227"/>
+        <w:jc w:val="both"/>
         <w:rPr/>
       </w:pPr>
       <w:r>
@@ -1540,16 +1608,18 @@
     </w:p>
     <w:p>
       <w:pPr>
-        <w:rPr/>
-      </w:pPr>
-      <w:r>
-        <w:rPr>
-          <w:rtl w:val="0"/>
-        </w:rPr>
-      </w:r>
-    </w:p>
-    <w:p>
-      <w:pPr>
+        <w:jc w:val="both"/>
+        <w:rPr/>
+      </w:pPr>
+      <w:r>
+        <w:rPr>
+          <w:rtl w:val="0"/>
+        </w:rPr>
+      </w:r>
+    </w:p>
+    <w:p>
+      <w:pPr>
+        <w:jc w:val="both"/>
         <w:rPr/>
       </w:pPr>
       <w:r>
@@ -1561,16 +1631,18 @@
     </w:p>
     <w:p>
       <w:pPr>
-        <w:rPr/>
-      </w:pPr>
-      <w:r>
-        <w:rPr>
-          <w:rtl w:val="0"/>
-        </w:rPr>
-      </w:r>
-    </w:p>
-    <w:p>
-      <w:pPr>
+        <w:jc w:val="both"/>
+        <w:rPr/>
+      </w:pPr>
+      <w:r>
+        <w:rPr>
+          <w:rtl w:val="0"/>
+        </w:rPr>
+      </w:r>
+    </w:p>
+    <w:p>
+      <w:pPr>
+        <w:jc w:val="both"/>
         <w:rPr/>
       </w:pPr>
       <w:r>
@@ -1590,6 +1662,7 @@
     </w:p>
     <w:p>
       <w:pPr>
+        <w:jc w:val="both"/>
         <w:rPr/>
       </w:pPr>
       <w:r>
@@ -1607,6 +1680,7 @@
         <w:pBdr>
           <w:bottom w:color="b89650" w:space="1" w:sz="8" w:val="single"/>
         </w:pBdr>
+        <w:jc w:val="both"/>
         <w:rPr/>
       </w:pPr>
       <w:r>
@@ -1619,6 +1693,7 @@
     <w:p>
       <w:pPr>
         <w:pStyle w:val="Heading2"/>
+        <w:jc w:val="both"/>
         <w:rPr/>
       </w:pPr>
       <w:r>
@@ -1631,6 +1706,7 @@
     <w:p>
       <w:pPr>
         <w:pStyle w:val="Heading3"/>
+        <w:jc w:val="both"/>
         <w:rPr/>
       </w:pPr>
       <w:r>
@@ -1642,6 +1718,7 @@
     </w:p>
     <w:p>
       <w:pPr>
+        <w:jc w:val="both"/>
         <w:rPr/>
       </w:pPr>
       <w:r>
@@ -1654,6 +1731,7 @@
     <w:p>
       <w:pPr>
         <w:pStyle w:val="Heading3"/>
+        <w:jc w:val="both"/>
         <w:rPr/>
       </w:pPr>
       <w:r>
@@ -1665,6 +1743,7 @@
     </w:p>
     <w:p>
       <w:pPr>
+        <w:jc w:val="both"/>
         <w:rPr/>
       </w:pPr>
       <w:r>
@@ -1677,6 +1756,7 @@
     <w:p>
       <w:pPr>
         <w:pStyle w:val="Heading2"/>
+        <w:jc w:val="both"/>
         <w:rPr/>
       </w:pPr>
       <w:r>
@@ -1689,6 +1769,7 @@
     <w:p>
       <w:pPr>
         <w:pStyle w:val="Heading3"/>
+        <w:jc w:val="both"/>
         <w:rPr/>
       </w:pPr>
       <w:r>
@@ -1700,6 +1781,7 @@
     </w:p>
     <w:p>
       <w:pPr>
+        <w:jc w:val="both"/>
         <w:rPr/>
       </w:pPr>
       <w:r>
@@ -1712,6 +1794,7 @@
     <w:p>
       <w:pPr>
         <w:pStyle w:val="Heading3"/>
+        <w:jc w:val="both"/>
         <w:rPr/>
       </w:pPr>
       <w:r>
@@ -1723,6 +1806,7 @@
     </w:p>
     <w:p>
       <w:pPr>
+        <w:jc w:val="both"/>
         <w:rPr/>
       </w:pPr>
       <w:r>
@@ -1735,6 +1819,7 @@
     <w:p>
       <w:pPr>
         <w:pStyle w:val="Heading3"/>
+        <w:jc w:val="both"/>
         <w:rPr/>
       </w:pPr>
       <w:r>
@@ -1746,6 +1831,7 @@
     </w:p>
     <w:p>
       <w:pPr>
+        <w:jc w:val="both"/>
         <w:rPr/>
       </w:pPr>
       <w:r>
@@ -1758,6 +1844,7 @@
     <w:p>
       <w:pPr>
         <w:pStyle w:val="Heading3"/>
+        <w:jc w:val="both"/>
         <w:rPr/>
       </w:pPr>
       <w:r>
@@ -1769,6 +1856,7 @@
     </w:p>
     <w:p>
       <w:pPr>
+        <w:jc w:val="both"/>
         <w:rPr/>
       </w:pPr>
       <w:r>
@@ -1781,6 +1869,7 @@
     <w:p>
       <w:pPr>
         <w:pStyle w:val="Heading2"/>
+        <w:jc w:val="both"/>
         <w:rPr/>
       </w:pPr>
       <w:r>
@@ -1792,6 +1881,7 @@
     </w:p>
     <w:p>
       <w:pPr>
+        <w:jc w:val="both"/>
         <w:rPr/>
       </w:pPr>
       <w:r>
@@ -1804,6 +1894,7 @@
     <w:p>
       <w:pPr>
         <w:pStyle w:val="Heading2"/>
+        <w:jc w:val="both"/>
         <w:rPr/>
       </w:pPr>
       <w:r>
@@ -1815,6 +1906,7 @@
     </w:p>
     <w:p>
       <w:pPr>
+        <w:jc w:val="both"/>
         <w:rPr/>
       </w:pPr>
       <w:r>
@@ -1827,6 +1919,7 @@
     <w:p>
       <w:pPr>
         <w:pStyle w:val="Heading2"/>
+        <w:jc w:val="both"/>
         <w:rPr/>
       </w:pPr>
       <w:r>
@@ -1838,6 +1931,7 @@
     </w:p>
     <w:p>
       <w:pPr>
+        <w:jc w:val="both"/>
         <w:rPr/>
       </w:pPr>
       <w:r>
@@ -1850,6 +1944,7 @@
     <w:p>
       <w:pPr>
         <w:pStyle w:val="Heading2"/>
+        <w:jc w:val="both"/>
         <w:rPr/>
       </w:pPr>
       <w:r>
@@ -1861,6 +1956,7 @@
     </w:p>
     <w:p>
       <w:pPr>
+        <w:jc w:val="both"/>
         <w:rPr/>
       </w:pPr>
       <w:r>
@@ -1873,6 +1969,7 @@
     <w:p>
       <w:pPr>
         <w:pStyle w:val="Heading2"/>
+        <w:jc w:val="both"/>
         <w:rPr/>
       </w:pPr>
       <w:r>
@@ -1884,6 +1981,7 @@
     </w:p>
     <w:p>
       <w:pPr>
+        <w:jc w:val="both"/>
         <w:rPr/>
       </w:pPr>
       <w:r>
@@ -1895,16 +1993,18 @@
     </w:p>
     <w:p>
       <w:pPr>
-        <w:rPr/>
-      </w:pPr>
-      <w:r>
-        <w:rPr>
-          <w:rtl w:val="0"/>
-        </w:rPr>
-      </w:r>
-    </w:p>
-    <w:p>
-      <w:pPr>
+        <w:jc w:val="both"/>
+        <w:rPr/>
+      </w:pPr>
+      <w:r>
+        <w:rPr>
+          <w:rtl w:val="0"/>
+        </w:rPr>
+      </w:r>
+    </w:p>
+    <w:p>
+      <w:pPr>
+        <w:jc w:val="both"/>
         <w:rPr/>
       </w:pPr>
       <w:r>
@@ -1922,6 +2022,7 @@
         <w:pBdr>
           <w:bottom w:color="b89650" w:space="1" w:sz="8" w:val="single"/>
         </w:pBdr>
+        <w:jc w:val="both"/>
         <w:rPr/>
       </w:pPr>
       <w:r>
@@ -1934,6 +2035,7 @@
     <w:p>
       <w:pPr>
         <w:pStyle w:val="Heading2"/>
+        <w:jc w:val="both"/>
         <w:rPr/>
       </w:pPr>
       <w:r>
@@ -1946,6 +2048,7 @@
     <w:p>
       <w:pPr>
         <w:pStyle w:val="Heading3"/>
+        <w:jc w:val="both"/>
         <w:rPr/>
       </w:pPr>
       <w:r>
@@ -1957,6 +2060,7 @@
     </w:p>
     <w:p>
       <w:pPr>
+        <w:jc w:val="both"/>
         <w:rPr/>
       </w:pPr>
       <w:r>
@@ -1969,6 +2073,7 @@
     <w:p>
       <w:pPr>
         <w:pStyle w:val="Heading3"/>
+        <w:jc w:val="both"/>
         <w:rPr/>
       </w:pPr>
       <w:r>
@@ -1980,6 +2085,7 @@
     </w:p>
     <w:p>
       <w:pPr>
+        <w:jc w:val="both"/>
         <w:rPr/>
       </w:pPr>
       <w:r>
@@ -1992,6 +2098,7 @@
     <w:p>
       <w:pPr>
         <w:pStyle w:val="Heading3"/>
+        <w:jc w:val="both"/>
         <w:rPr/>
       </w:pPr>
       <w:r>
@@ -2003,6 +2110,7 @@
     </w:p>
     <w:p>
       <w:pPr>
+        <w:jc w:val="both"/>
         <w:rPr/>
       </w:pPr>
       <w:r>
@@ -2015,6 +2123,7 @@
     <w:p>
       <w:pPr>
         <w:pStyle w:val="Heading2"/>
+        <w:jc w:val="both"/>
         <w:rPr/>
       </w:pPr>
       <w:r>
@@ -2026,6 +2135,7 @@
     </w:p>
     <w:p>
       <w:pPr>
+        <w:jc w:val="both"/>
         <w:rPr/>
       </w:pPr>
       <w:r>
@@ -2037,6 +2147,7 @@
     </w:p>
     <w:p>
       <w:pPr>
+        <w:jc w:val="both"/>
         <w:rPr/>
       </w:pPr>
       <w:r>
@@ -2049,6 +2160,7 @@
     <w:p>
       <w:pPr>
         <w:pStyle w:val="Heading2"/>
+        <w:jc w:val="both"/>
         <w:rPr/>
       </w:pPr>
       <w:r>
@@ -2061,6 +2173,7 @@
     <w:p>
       <w:pPr>
         <w:pStyle w:val="Heading3"/>
+        <w:jc w:val="both"/>
         <w:rPr/>
       </w:pPr>
       <w:r>
@@ -2072,6 +2185,7 @@
     </w:p>
     <w:p>
       <w:pPr>
+        <w:jc w:val="both"/>
         <w:rPr/>
       </w:pPr>
       <w:r>
@@ -2084,6 +2198,7 @@
     <w:p>
       <w:pPr>
         <w:pStyle w:val="Heading3"/>
+        <w:jc w:val="both"/>
         <w:rPr/>
       </w:pPr>
       <w:r>
@@ -2095,6 +2210,7 @@
     </w:p>
     <w:p>
       <w:pPr>
+        <w:jc w:val="both"/>
         <w:rPr/>
       </w:pPr>
       <w:r>
@@ -2107,6 +2223,7 @@
     <w:p>
       <w:pPr>
         <w:pStyle w:val="Heading2"/>
+        <w:jc w:val="both"/>
         <w:rPr/>
       </w:pPr>
       <w:r>
@@ -2119,6 +2236,7 @@
     <w:p>
       <w:pPr>
         <w:pStyle w:val="Heading3"/>
+        <w:jc w:val="both"/>
         <w:rPr/>
       </w:pPr>
       <w:r>
@@ -2130,6 +2248,7 @@
     </w:p>
     <w:p>
       <w:pPr>
+        <w:jc w:val="both"/>
         <w:rPr/>
       </w:pPr>
       <w:r>
@@ -2142,6 +2261,7 @@
     <w:p>
       <w:pPr>
         <w:pStyle w:val="Heading3"/>
+        <w:jc w:val="both"/>
         <w:rPr/>
       </w:pPr>
       <w:r>
@@ -2153,6 +2273,7 @@
     </w:p>
     <w:p>
       <w:pPr>
+        <w:jc w:val="both"/>
         <w:rPr/>
       </w:pPr>
       <w:r>
@@ -2165,6 +2286,7 @@
     <w:p>
       <w:pPr>
         <w:pStyle w:val="Heading3"/>
+        <w:jc w:val="both"/>
         <w:rPr/>
       </w:pPr>
       <w:r>
@@ -2176,6 +2298,7 @@
     </w:p>
     <w:p>
       <w:pPr>
+        <w:jc w:val="both"/>
         <w:rPr/>
       </w:pPr>
       <w:r>
@@ -2188,6 +2311,7 @@
     <w:p>
       <w:pPr>
         <w:pStyle w:val="Heading2"/>
+        <w:jc w:val="both"/>
         <w:rPr/>
       </w:pPr>
       <w:r>
@@ -2199,11 +2323,12 @@
     </w:p>
     <w:p>
       <w:pPr>
+        <w:jc w:val="both"/>
         <w:rPr/>
       </w:pPr>
       <w:sdt>
         <w:sdtPr>
-          <w:id w:val="-1168986914"/>
+          <w:id w:val="-550212684"/>
           <w:tag w:val="goog_rdk_0"/>
         </w:sdtPr>
         <w:sdtContent>
@@ -2220,6 +2345,7 @@
     <w:p>
       <w:pPr>
         <w:pStyle w:val="Heading2"/>
+        <w:jc w:val="both"/>
         <w:rPr/>
       </w:pPr>
       <w:r>
@@ -2232,6 +2358,7 @@
     <w:p>
       <w:pPr>
         <w:pStyle w:val="Heading3"/>
+        <w:jc w:val="both"/>
         <w:rPr/>
       </w:pPr>
       <w:r>
@@ -2243,6 +2370,7 @@
     </w:p>
     <w:p>
       <w:pPr>
+        <w:jc w:val="both"/>
         <w:rPr/>
       </w:pPr>
       <w:r>
@@ -2255,6 +2383,7 @@
     <w:p>
       <w:pPr>
         <w:pStyle w:val="Heading3"/>
+        <w:jc w:val="both"/>
         <w:rPr/>
       </w:pPr>
       <w:r>
@@ -2266,6 +2395,7 @@
     </w:p>
     <w:p>
       <w:pPr>
+        <w:jc w:val="both"/>
         <w:rPr/>
       </w:pPr>
       <w:r>
@@ -2278,6 +2408,7 @@
     <w:p>
       <w:pPr>
         <w:pStyle w:val="Heading3"/>
+        <w:jc w:val="both"/>
         <w:rPr/>
       </w:pPr>
       <w:r>
@@ -2289,6 +2420,7 @@
     </w:p>
     <w:p>
       <w:pPr>
+        <w:jc w:val="both"/>
         <w:rPr/>
       </w:pPr>
       <w:r>
@@ -2301,6 +2433,7 @@
     <w:p>
       <w:pPr>
         <w:pStyle w:val="Heading3"/>
+        <w:jc w:val="both"/>
         <w:rPr/>
       </w:pPr>
       <w:r>
@@ -2312,6 +2445,7 @@
     </w:p>
     <w:p>
       <w:pPr>
+        <w:jc w:val="both"/>
         <w:rPr/>
       </w:pPr>
       <w:r>
@@ -2324,6 +2458,7 @@
     <w:p>
       <w:pPr>
         <w:pStyle w:val="Heading2"/>
+        <w:jc w:val="both"/>
         <w:rPr/>
       </w:pPr>
       <w:r>
@@ -2335,6 +2470,7 @@
     </w:p>
     <w:p>
       <w:pPr>
+        <w:jc w:val="both"/>
         <w:rPr/>
       </w:pPr>
       <w:r>
@@ -2346,6 +2482,7 @@
     </w:p>
     <w:p>
       <w:pPr>
+        <w:jc w:val="both"/>
         <w:rPr/>
       </w:pPr>
       <w:r>
@@ -2358,6 +2495,7 @@
       <w:pPr>
         <w:spacing w:after="20" w:lineRule="auto"/>
         <w:ind w:left="397" w:hanging="227"/>
+        <w:jc w:val="both"/>
         <w:rPr/>
       </w:pPr>
       <w:r>
@@ -2386,6 +2524,7 @@
       <w:pPr>
         <w:spacing w:after="20" w:lineRule="auto"/>
         <w:ind w:left="397" w:hanging="227"/>
+        <w:jc w:val="both"/>
         <w:rPr/>
       </w:pPr>
       <w:r>
@@ -2414,6 +2553,7 @@
       <w:pPr>
         <w:spacing w:after="20" w:lineRule="auto"/>
         <w:ind w:left="397" w:hanging="227"/>
+        <w:jc w:val="both"/>
         <w:rPr/>
       </w:pPr>
       <w:r>
@@ -2442,6 +2582,7 @@
       <w:pPr>
         <w:spacing w:after="20" w:lineRule="auto"/>
         <w:ind w:left="397" w:hanging="227"/>
+        <w:jc w:val="both"/>
         <w:rPr/>
       </w:pPr>
       <w:r>
@@ -2468,16 +2609,18 @@
     </w:p>
     <w:p>
       <w:pPr>
-        <w:rPr/>
-      </w:pPr>
-      <w:r>
-        <w:rPr>
-          <w:rtl w:val="0"/>
-        </w:rPr>
-      </w:r>
-    </w:p>
-    <w:p>
-      <w:pPr>
+        <w:jc w:val="both"/>
+        <w:rPr/>
+      </w:pPr>
+      <w:r>
+        <w:rPr>
+          <w:rtl w:val="0"/>
+        </w:rPr>
+      </w:r>
+    </w:p>
+    <w:p>
+      <w:pPr>
+        <w:jc w:val="both"/>
         <w:rPr/>
       </w:pPr>
       <w:r>
@@ -2490,6 +2633,7 @@
     <w:p>
       <w:pPr>
         <w:pStyle w:val="Heading2"/>
+        <w:jc w:val="both"/>
         <w:rPr/>
       </w:pPr>
       <w:r>
@@ -2501,6 +2645,7 @@
     </w:p>
     <w:p>
       <w:pPr>
+        <w:jc w:val="both"/>
         <w:rPr/>
       </w:pPr>
       <w:r>
@@ -2512,6 +2657,7 @@
     </w:p>
     <w:p>
       <w:pPr>
+        <w:jc w:val="both"/>
         <w:rPr/>
       </w:pPr>
       <w:r>
@@ -2523,6 +2669,7 @@
     </w:p>
     <w:p>
       <w:pPr>
+        <w:jc w:val="both"/>
         <w:rPr/>
       </w:pPr>
       <w:r>
@@ -2535,6 +2682,7 @@
     <w:p>
       <w:pPr>
         <w:pStyle w:val="Heading2"/>
+        <w:jc w:val="both"/>
         <w:rPr/>
       </w:pPr>
       <w:r>
@@ -2546,6 +2694,7 @@
     </w:p>
     <w:p>
       <w:pPr>
+        <w:jc w:val="both"/>
         <w:rPr/>
       </w:pPr>
       <w:r>
@@ -2557,6 +2706,7 @@
     </w:p>
     <w:p>
       <w:pPr>
+        <w:jc w:val="both"/>
         <w:rPr/>
       </w:pPr>
       <w:r>
@@ -2574,6 +2724,7 @@
         <w:pBdr>
           <w:bottom w:color="b89650" w:space="1" w:sz="8" w:val="single"/>
         </w:pBdr>
+        <w:jc w:val="both"/>
         <w:rPr/>
       </w:pPr>
       <w:r>
@@ -2586,6 +2737,7 @@
     <w:p>
       <w:pPr>
         <w:pStyle w:val="Heading2"/>
+        <w:jc w:val="both"/>
         <w:rPr/>
       </w:pPr>
       <w:r>
@@ -2597,6 +2749,7 @@
     </w:p>
     <w:p>
       <w:pPr>
+        <w:jc w:val="both"/>
         <w:rPr/>
       </w:pPr>
       <w:r>
@@ -2608,6 +2761,7 @@
     </w:p>
     <w:p>
       <w:pPr>
+        <w:jc w:val="both"/>
         <w:rPr/>
       </w:pPr>
       <w:r>
@@ -2619,18 +2773,20 @@
     </w:p>
     <w:p>
       <w:pPr>
-        <w:rPr/>
-      </w:pPr>
-      <w:r>
-        <w:rPr>
-          <w:rtl w:val="0"/>
-        </w:rPr>
-        <w:t xml:space="preserve">Nombre de places : 65 logements libres/abordables + 26 sociaux + 60 visiteur dont 8 PMR, selon les prescriptions du PLU.</w:t>
+        <w:jc w:val="both"/>
+        <w:rPr/>
+      </w:pPr>
+      <w:r>
+        <w:rPr>
+          <w:rtl w:val="0"/>
+        </w:rPr>
+        <w:t xml:space="preserve">Nombre de places : 65 logements libres/abordables + 24 sociaux + 55 visiteur dont 8 PMR, selon les prescriptions du PLU.</w:t>
       </w:r>
     </w:p>
     <w:p>
       <w:pPr>
         <w:pStyle w:val="Heading2"/>
+        <w:jc w:val="both"/>
         <w:rPr/>
       </w:pPr>
       <w:r>
@@ -2642,11 +2798,12 @@
     </w:p>
     <w:p>
       <w:pPr>
+        <w:jc w:val="both"/>
         <w:rPr/>
       </w:pPr>
       <w:sdt>
         <w:sdtPr>
-          <w:id w:val="1133467585"/>
+          <w:id w:val="-1713805416"/>
           <w:tag w:val="goog_rdk_1"/>
         </w:sdtPr>
         <w:sdtContent>
@@ -2662,6 +2819,7 @@
     </w:p>
     <w:p>
       <w:pPr>
+        <w:jc w:val="both"/>
         <w:rPr/>
       </w:pPr>
       <w:r>
@@ -2673,16 +2831,18 @@
     </w:p>
     <w:p>
       <w:pPr>
-        <w:rPr/>
-      </w:pPr>
-      <w:r>
-        <w:rPr>
-          <w:rtl w:val="0"/>
-        </w:rPr>
-      </w:r>
-    </w:p>
-    <w:p>
-      <w:pPr>
+        <w:jc w:val="both"/>
+        <w:rPr/>
+      </w:pPr>
+      <w:r>
+        <w:rPr>
+          <w:rtl w:val="0"/>
+        </w:rPr>
+      </w:r>
+    </w:p>
+    <w:p>
+      <w:pPr>
+        <w:jc w:val="both"/>
         <w:rPr/>
       </w:pPr>
       <w:r>
@@ -2700,6 +2860,7 @@
         <w:pBdr>
           <w:bottom w:color="b89650" w:space="1" w:sz="8" w:val="single"/>
         </w:pBdr>
+        <w:jc w:val="both"/>
         <w:rPr/>
       </w:pPr>
       <w:r>
@@ -2712,6 +2873,7 @@
     <w:p>
       <w:pPr>
         <w:pStyle w:val="Heading2"/>
+        <w:jc w:val="both"/>
         <w:rPr/>
       </w:pPr>
       <w:r>
@@ -2723,6 +2885,7 @@
     </w:p>
     <w:p>
       <w:pPr>
+        <w:jc w:val="both"/>
         <w:rPr/>
       </w:pPr>
       <w:r>
@@ -2734,6 +2897,7 @@
     </w:p>
     <w:p>
       <w:pPr>
+        <w:jc w:val="both"/>
         <w:rPr/>
       </w:pPr>
       <w:r>
@@ -2746,6 +2910,7 @@
     <w:p>
       <w:pPr>
         <w:pStyle w:val="Heading2"/>
+        <w:jc w:val="both"/>
         <w:rPr/>
       </w:pPr>
       <w:r>
@@ -2757,6 +2922,7 @@
     </w:p>
     <w:p>
       <w:pPr>
+        <w:jc w:val="both"/>
         <w:rPr/>
       </w:pPr>
       <w:r>
@@ -2769,6 +2935,7 @@
     <w:p>
       <w:pPr>
         <w:pStyle w:val="Heading2"/>
+        <w:jc w:val="both"/>
         <w:rPr/>
       </w:pPr>
       <w:r>
@@ -2780,6 +2947,7 @@
     </w:p>
     <w:p>
       <w:pPr>
+        <w:jc w:val="both"/>
         <w:rPr/>
       </w:pPr>
       <w:r>
@@ -2792,6 +2960,7 @@
     <w:p>
       <w:pPr>
         <w:pStyle w:val="Heading2"/>
+        <w:jc w:val="both"/>
         <w:rPr/>
       </w:pPr>
       <w:r>
@@ -2803,6 +2972,7 @@
     </w:p>
     <w:p>
       <w:pPr>
+        <w:jc w:val="both"/>
         <w:rPr/>
       </w:pPr>
       <w:r>
@@ -2815,6 +2985,7 @@
     <w:p>
       <w:pPr>
         <w:pStyle w:val="Heading2"/>
+        <w:jc w:val="both"/>
         <w:rPr/>
       </w:pPr>
       <w:r>
@@ -2826,6 +2997,7 @@
     </w:p>
     <w:p>
       <w:pPr>
+        <w:jc w:val="both"/>
         <w:rPr/>
       </w:pPr>
       <w:r>
@@ -2837,6 +3009,7 @@
     </w:p>
     <w:p>
       <w:pPr>
+        <w:jc w:val="both"/>
         <w:rPr/>
       </w:pPr>
       <w:r>
@@ -2848,6 +3021,7 @@
     </w:p>
     <w:p>
       <w:pPr>
+        <w:jc w:val="both"/>
         <w:rPr/>
       </w:pPr>
       <w:r>
@@ -2859,6 +3033,7 @@
     </w:p>
     <w:p>
       <w:pPr>
+        <w:jc w:val="both"/>
         <w:rPr/>
       </w:pPr>
       <w:r>
@@ -2876,6 +3051,7 @@
         <w:pBdr>
           <w:bottom w:color="b89650" w:space="1" w:sz="8" w:val="single"/>
         </w:pBdr>
+        <w:jc w:val="both"/>
         <w:rPr/>
       </w:pPr>
       <w:r>
@@ -2888,6 +3064,7 @@
     <w:p>
       <w:pPr>
         <w:pStyle w:val="Heading2"/>
+        <w:jc w:val="both"/>
         <w:rPr/>
       </w:pPr>
       <w:r>
@@ -2899,11 +3076,12 @@
     </w:p>
     <w:p>
       <w:pPr>
+        <w:jc w:val="both"/>
         <w:rPr/>
       </w:pPr>
       <w:sdt>
         <w:sdtPr>
-          <w:id w:val="-48507219"/>
+          <w:id w:val="-1974618130"/>
           <w:tag w:val="goog_rdk_2"/>
         </w:sdtPr>
         <w:sdtContent>
@@ -2920,6 +3098,7 @@
     <w:p>
       <w:pPr>
         <w:pStyle w:val="Heading2"/>
+        <w:jc w:val="both"/>
         <w:rPr/>
       </w:pPr>
       <w:r>
@@ -2931,6 +3110,7 @@
     </w:p>
     <w:p>
       <w:pPr>
+        <w:jc w:val="both"/>
         <w:rPr/>
       </w:pPr>
       <w:r>
@@ -2943,6 +3123,7 @@
     <w:p>
       <w:pPr>
         <w:pStyle w:val="Heading2"/>
+        <w:jc w:val="both"/>
         <w:rPr/>
       </w:pPr>
       <w:r>
@@ -2954,11 +3135,12 @@
     </w:p>
     <w:p>
       <w:pPr>
+        <w:jc w:val="both"/>
         <w:rPr/>
       </w:pPr>
       <w:sdt>
         <w:sdtPr>
-          <w:id w:val="1723271246"/>
+          <w:id w:val="-1116757537"/>
           <w:tag w:val="goog_rdk_3"/>
         </w:sdtPr>
         <w:sdtContent>
@@ -2975,6 +3157,7 @@
     <w:p>
       <w:pPr>
         <w:pStyle w:val="Heading2"/>
+        <w:jc w:val="both"/>
         <w:rPr/>
       </w:pPr>
       <w:r>
@@ -2986,6 +3169,7 @@
     </w:p>
     <w:p>
       <w:pPr>
+        <w:jc w:val="both"/>
         <w:rPr/>
       </w:pPr>
       <w:r>
@@ -2998,6 +3182,7 @@
     <w:p>
       <w:pPr>
         <w:pStyle w:val="Heading2"/>
+        <w:jc w:val="both"/>
         <w:rPr/>
       </w:pPr>
       <w:r>
@@ -3009,6 +3194,7 @@
     </w:p>
     <w:p>
       <w:pPr>
+        <w:jc w:val="both"/>
         <w:rPr/>
       </w:pPr>
       <w:r>
@@ -3021,6 +3207,7 @@
     <w:p>
       <w:pPr>
         <w:pStyle w:val="Heading2"/>
+        <w:jc w:val="both"/>
         <w:rPr/>
       </w:pPr>
       <w:r>
@@ -3032,6 +3219,7 @@
     </w:p>
     <w:p>
       <w:pPr>
+        <w:jc w:val="both"/>
         <w:rPr/>
       </w:pPr>
       <w:r>
@@ -3043,6 +3231,7 @@
     </w:p>
     <w:p>
       <w:pPr>
+        <w:jc w:val="both"/>
         <w:rPr/>
       </w:pPr>
       <w:r>
@@ -3060,6 +3249,7 @@
         <w:pBdr>
           <w:bottom w:color="b89650" w:space="1" w:sz="8" w:val="single"/>
         </w:pBdr>
+        <w:jc w:val="both"/>
         <w:rPr/>
       </w:pPr>
       <w:r>
@@ -3072,6 +3262,7 @@
     <w:p>
       <w:pPr>
         <w:pStyle w:val="Heading2"/>
+        <w:jc w:val="both"/>
         <w:rPr/>
       </w:pPr>
       <w:r>
@@ -3083,11 +3274,12 @@
     </w:p>
     <w:p>
       <w:pPr>
+        <w:jc w:val="both"/>
         <w:rPr/>
       </w:pPr>
       <w:sdt>
         <w:sdtPr>
-          <w:id w:val="1418752565"/>
+          <w:id w:val="1760935969"/>
           <w:tag w:val="goog_rdk_4"/>
         </w:sdtPr>
         <w:sdtContent>
@@ -3104,6 +3296,7 @@
     <w:p>
       <w:pPr>
         <w:pStyle w:val="Heading2"/>
+        <w:jc w:val="both"/>
         <w:rPr/>
       </w:pPr>
       <w:r>
@@ -3115,6 +3308,7 @@
     </w:p>
     <w:p>
       <w:pPr>
+        <w:jc w:val="both"/>
         <w:rPr/>
       </w:pPr>
       <w:r>
@@ -3127,6 +3321,7 @@
     <w:p>
       <w:pPr>
         <w:pStyle w:val="Heading2"/>
+        <w:jc w:val="both"/>
         <w:rPr/>
       </w:pPr>
       <w:r>
@@ -3138,6 +3333,7 @@
     </w:p>
     <w:p>
       <w:pPr>
+        <w:jc w:val="both"/>
         <w:rPr/>
       </w:pPr>
       <w:r>
@@ -3150,6 +3346,7 @@
     <w:p>
       <w:pPr>
         <w:pStyle w:val="Heading2"/>
+        <w:jc w:val="both"/>
         <w:rPr/>
       </w:pPr>
       <w:r>
@@ -3161,6 +3358,7 @@
     </w:p>
     <w:p>
       <w:pPr>
+        <w:jc w:val="both"/>
         <w:rPr/>
       </w:pPr>
       <w:r>
@@ -3173,6 +3371,7 @@
     <w:p>
       <w:pPr>
         <w:pStyle w:val="Heading2"/>
+        <w:jc w:val="both"/>
         <w:rPr/>
       </w:pPr>
       <w:r>
@@ -3184,6 +3383,7 @@
     </w:p>
     <w:p>
       <w:pPr>
+        <w:jc w:val="both"/>
         <w:rPr/>
       </w:pPr>
       <w:r>
@@ -3195,6 +3395,7 @@
     </w:p>
     <w:p>
       <w:pPr>
+        <w:jc w:val="both"/>
         <w:rPr/>
       </w:pPr>
       <w:r>
@@ -3212,6 +3413,7 @@
         <w:pBdr>
           <w:bottom w:color="b89650" w:space="1" w:sz="8" w:val="single"/>
         </w:pBdr>
+        <w:jc w:val="both"/>
         <w:rPr/>
       </w:pPr>
       <w:r>
@@ -3224,6 +3426,7 @@
     <w:p>
       <w:pPr>
         <w:pStyle w:val="Heading2"/>
+        <w:jc w:val="both"/>
         <w:rPr/>
       </w:pPr>
       <w:r>
@@ -3235,6 +3438,7 @@
     </w:p>
     <w:p>
       <w:pPr>
+        <w:jc w:val="both"/>
         <w:rPr/>
       </w:pPr>
       <w:r>
@@ -3248,6 +3452,7 @@
       <w:pPr>
         <w:spacing w:after="20" w:lineRule="auto"/>
         <w:ind w:left="397" w:hanging="227"/>
+        <w:jc w:val="both"/>
         <w:rPr/>
       </w:pPr>
       <w:r>
@@ -3268,6 +3473,7 @@
       <w:pPr>
         <w:spacing w:after="20" w:lineRule="auto"/>
         <w:ind w:left="397" w:hanging="227"/>
+        <w:jc w:val="both"/>
         <w:rPr/>
       </w:pPr>
       <w:r>
@@ -3288,6 +3494,7 @@
       <w:pPr>
         <w:spacing w:after="20" w:lineRule="auto"/>
         <w:ind w:left="397" w:hanging="227"/>
+        <w:jc w:val="both"/>
         <w:rPr/>
       </w:pPr>
       <w:r>
@@ -3308,6 +3515,7 @@
       <w:pPr>
         <w:spacing w:after="20" w:lineRule="auto"/>
         <w:ind w:left="397" w:hanging="227"/>
+        <w:jc w:val="both"/>
         <w:rPr/>
       </w:pPr>
       <w:r>
@@ -3327,6 +3535,7 @@
     <w:p>
       <w:pPr>
         <w:pStyle w:val="Heading2"/>
+        <w:jc w:val="both"/>
         <w:rPr/>
       </w:pPr>
       <w:r>
@@ -3340,6 +3549,7 @@
       <w:pPr>
         <w:spacing w:after="20" w:lineRule="auto"/>
         <w:ind w:left="397" w:hanging="227"/>
+        <w:jc w:val="both"/>
         <w:rPr/>
       </w:pPr>
       <w:r>
@@ -3360,6 +3570,7 @@
       <w:pPr>
         <w:spacing w:after="20" w:lineRule="auto"/>
         <w:ind w:left="397" w:hanging="227"/>
+        <w:jc w:val="both"/>
         <w:rPr/>
       </w:pPr>
       <w:r>
@@ -3380,6 +3591,7 @@
       <w:pPr>
         <w:spacing w:after="20" w:lineRule="auto"/>
         <w:ind w:left="397" w:hanging="227"/>
+        <w:jc w:val="both"/>
         <w:rPr/>
       </w:pPr>
       <w:r>
@@ -3399,6 +3611,7 @@
     <w:p>
       <w:pPr>
         <w:pStyle w:val="Heading2"/>
+        <w:jc w:val="both"/>
         <w:rPr/>
       </w:pPr>
       <w:r>
@@ -3412,6 +3625,7 @@
       <w:pPr>
         <w:spacing w:after="20" w:lineRule="auto"/>
         <w:ind w:left="397" w:hanging="227"/>
+        <w:jc w:val="both"/>
         <w:rPr/>
       </w:pPr>
       <w:r>
@@ -3432,6 +3646,7 @@
       <w:pPr>
         <w:spacing w:after="20" w:lineRule="auto"/>
         <w:ind w:left="397" w:hanging="227"/>
+        <w:jc w:val="both"/>
         <w:rPr/>
       </w:pPr>
       <w:r>
@@ -3452,6 +3667,7 @@
       <w:pPr>
         <w:spacing w:after="20" w:lineRule="auto"/>
         <w:ind w:left="397" w:hanging="227"/>
+        <w:jc w:val="both"/>
         <w:rPr/>
       </w:pPr>
       <w:r>
@@ -3471,6 +3687,7 @@
     <w:p>
       <w:pPr>
         <w:pStyle w:val="Heading2"/>
+        <w:jc w:val="both"/>
         <w:rPr/>
       </w:pPr>
       <w:r>
@@ -3484,6 +3701,7 @@
       <w:pPr>
         <w:spacing w:after="20" w:lineRule="auto"/>
         <w:ind w:left="397" w:hanging="227"/>
+        <w:jc w:val="both"/>
         <w:rPr/>
       </w:pPr>
       <w:r>
@@ -3504,6 +3722,7 @@
       <w:pPr>
         <w:spacing w:after="20" w:lineRule="auto"/>
         <w:ind w:left="397" w:hanging="227"/>
+        <w:jc w:val="both"/>
         <w:rPr/>
       </w:pPr>
       <w:r>
@@ -3515,7 +3734,7 @@
       </w:r>
       <w:sdt>
         <w:sdtPr>
-          <w:id w:val="905871384"/>
+          <w:id w:val="871192526"/>
           <w:tag w:val="goog_rdk_5"/>
         </w:sdtPr>
         <w:sdtContent>
@@ -3531,6 +3750,7 @@
     </w:p>
     <w:p>
       <w:pPr>
+        <w:jc w:val="both"/>
         <w:rPr/>
       </w:pPr>
       <w:r>
@@ -3548,6 +3768,7 @@
         <w:pBdr>
           <w:bottom w:color="b89650" w:space="1" w:sz="8" w:val="single"/>
         </w:pBdr>
+        <w:jc w:val="both"/>
         <w:rPr/>
       </w:pPr>
       <w:r>
@@ -3559,6 +3780,7 @@
     </w:p>
     <w:p>
       <w:pPr>
+        <w:jc w:val="both"/>
         <w:rPr/>
       </w:pPr>
       <w:r>
@@ -3572,6 +3794,7 @@
       <w:pPr>
         <w:spacing w:after="20" w:lineRule="auto"/>
         <w:ind w:left="397" w:hanging="227"/>
+        <w:jc w:val="both"/>
         <w:rPr/>
       </w:pPr>
       <w:r>
@@ -3592,6 +3815,7 @@
       <w:pPr>
         <w:spacing w:after="20" w:lineRule="auto"/>
         <w:ind w:left="397" w:hanging="227"/>
+        <w:jc w:val="both"/>
         <w:rPr/>
       </w:pPr>
       <w:r>
@@ -3612,6 +3836,7 @@
       <w:pPr>
         <w:spacing w:after="20" w:lineRule="auto"/>
         <w:ind w:left="397" w:hanging="227"/>
+        <w:jc w:val="both"/>
         <w:rPr/>
       </w:pPr>
       <w:r>
@@ -3630,16 +3855,18 @@
     </w:p>
     <w:p>
       <w:pPr>
-        <w:rPr/>
-      </w:pPr>
-      <w:r>
-        <w:rPr>
-          <w:rtl w:val="0"/>
-        </w:rPr>
-      </w:r>
-    </w:p>
-    <w:p>
-      <w:pPr>
+        <w:jc w:val="both"/>
+        <w:rPr/>
+      </w:pPr>
+      <w:r>
+        <w:rPr>
+          <w:rtl w:val="0"/>
+        </w:rPr>
+      </w:r>
+    </w:p>
+    <w:p>
+      <w:pPr>
+        <w:jc w:val="both"/>
         <w:rPr/>
       </w:pPr>
       <w:r>
@@ -3651,6 +3878,7 @@
     </w:p>
     <w:p>
       <w:pPr>
+        <w:jc w:val="both"/>
         <w:rPr/>
       </w:pPr>
       <w:r>
@@ -3668,6 +3896,7 @@
         <w:pBdr>
           <w:bottom w:color="b89650" w:space="1" w:sz="8" w:val="single"/>
         </w:pBdr>
+        <w:jc w:val="both"/>
         <w:rPr/>
       </w:pPr>
       <w:r>
@@ -3679,6 +3908,7 @@
     </w:p>
     <w:p>
       <w:pPr>
+        <w:jc w:val="both"/>
         <w:rPr/>
       </w:pPr>
       <w:r>
@@ -3703,6 +3933,7 @@
       <w:pPr>
         <w:spacing w:after="20" w:lineRule="auto"/>
         <w:ind w:left="397" w:hanging="227"/>
+        <w:jc w:val="both"/>
         <w:rPr/>
       </w:pPr>
       <w:r>
@@ -3723,6 +3954,7 @@
       <w:pPr>
         <w:spacing w:after="20" w:lineRule="auto"/>
         <w:ind w:left="397" w:hanging="227"/>
+        <w:jc w:val="both"/>
         <w:rPr/>
       </w:pPr>
       <w:r>
@@ -3743,6 +3975,7 @@
       <w:pPr>
         <w:spacing w:after="20" w:lineRule="auto"/>
         <w:ind w:left="397" w:hanging="227"/>
+        <w:jc w:val="both"/>
         <w:rPr/>
       </w:pPr>
       <w:r>
@@ -3763,6 +3996,7 @@
       <w:pPr>
         <w:spacing w:after="20" w:lineRule="auto"/>
         <w:ind w:left="397" w:hanging="227"/>
+        <w:jc w:val="both"/>
         <w:rPr/>
       </w:pPr>
       <w:r>
@@ -3783,6 +4017,7 @@
       <w:pPr>
         <w:spacing w:after="20" w:lineRule="auto"/>
         <w:ind w:left="397" w:hanging="227"/>
+        <w:jc w:val="both"/>
         <w:rPr/>
       </w:pPr>
       <w:r>
@@ -3801,16 +4036,18 @@
     </w:p>
     <w:p>
       <w:pPr>
-        <w:rPr/>
-      </w:pPr>
-      <w:r>
-        <w:rPr>
-          <w:rtl w:val="0"/>
-        </w:rPr>
-      </w:r>
-    </w:p>
-    <w:p>
-      <w:pPr>
+        <w:jc w:val="both"/>
+        <w:rPr/>
+      </w:pPr>
+      <w:r>
+        <w:rPr>
+          <w:rtl w:val="0"/>
+        </w:rPr>
+      </w:r>
+    </w:p>
+    <w:p>
+      <w:pPr>
+        <w:jc w:val="both"/>
         <w:rPr/>
       </w:pPr>
       <w:r>
@@ -3832,26 +4069,29 @@
     </w:p>
     <w:p>
       <w:pPr>
-        <w:rPr/>
-      </w:pPr>
-      <w:r>
-        <w:rPr>
-          <w:rtl w:val="0"/>
-        </w:rPr>
-      </w:r>
-    </w:p>
-    <w:p>
-      <w:pPr>
-        <w:rPr/>
-      </w:pPr>
-      <w:r>
-        <w:rPr>
-          <w:rtl w:val="0"/>
-        </w:rPr>
-      </w:r>
-    </w:p>
-    <w:p>
-      <w:pPr>
+        <w:jc w:val="both"/>
+        <w:rPr/>
+      </w:pPr>
+      <w:r>
+        <w:rPr>
+          <w:rtl w:val="0"/>
+        </w:rPr>
+      </w:r>
+    </w:p>
+    <w:p>
+      <w:pPr>
+        <w:jc w:val="both"/>
+        <w:rPr/>
+      </w:pPr>
+      <w:r>
+        <w:rPr>
+          <w:rtl w:val="0"/>
+        </w:rPr>
+      </w:r>
+    </w:p>
+    <w:p>
+      <w:pPr>
+        <w:jc w:val="both"/>
         <w:rPr/>
       </w:pPr>
       <w:r>
@@ -3896,6 +4136,7 @@
           <w:tcPr/>
           <w:p>
             <w:pPr>
+              <w:jc w:val="both"/>
               <w:rPr/>
             </w:pPr>
             <w:r>
@@ -3910,6 +4151,7 @@
           <w:tcPr/>
           <w:p>
             <w:pPr>
+              <w:jc w:val="both"/>
               <w:rPr/>
             </w:pPr>
             <w:r>
@@ -3929,6 +4171,7 @@
           <w:tcPr/>
           <w:p>
             <w:pPr>
+              <w:jc w:val="both"/>
               <w:rPr/>
             </w:pPr>
             <w:r>
@@ -3943,6 +4186,7 @@
           <w:tcPr/>
           <w:p>
             <w:pPr>
+              <w:jc w:val="both"/>
               <w:rPr/>
             </w:pPr>
             <w:r>
@@ -3962,6 +4206,7 @@
           <w:tcPr/>
           <w:p>
             <w:pPr>
+              <w:jc w:val="both"/>
               <w:rPr/>
             </w:pPr>
             <w:r>
@@ -3976,6 +4221,7 @@
           <w:tcPr/>
           <w:p>
             <w:pPr>
+              <w:jc w:val="both"/>
               <w:rPr/>
             </w:pPr>
             <w:r>
@@ -3990,26 +4236,29 @@
     </w:tbl>
     <w:p>
       <w:pPr>
-        <w:rPr/>
-      </w:pPr>
-      <w:r>
-        <w:rPr>
-          <w:rtl w:val="0"/>
-        </w:rPr>
-      </w:r>
-    </w:p>
-    <w:p>
-      <w:pPr>
-        <w:rPr/>
-      </w:pPr>
-      <w:r>
-        <w:rPr>
-          <w:rtl w:val="0"/>
-        </w:rPr>
-      </w:r>
-    </w:p>
-    <w:p>
-      <w:pPr>
+        <w:jc w:val="both"/>
+        <w:rPr/>
+      </w:pPr>
+      <w:r>
+        <w:rPr>
+          <w:rtl w:val="0"/>
+        </w:rPr>
+      </w:r>
+    </w:p>
+    <w:p>
+      <w:pPr>
+        <w:jc w:val="both"/>
+        <w:rPr/>
+      </w:pPr>
+      <w:r>
+        <w:rPr>
+          <w:rtl w:val="0"/>
+        </w:rPr>
+      </w:r>
+    </w:p>
+    <w:p>
+      <w:pPr>
+        <w:jc w:val="both"/>
         <w:rPr/>
       </w:pPr>
       <w:r>

</xml_diff>